<commit_message>
docs(manaco): insert complete station 2-4.5 answers into Caso_Manaco_RESUELTO.docx and document 10 duplicate composite keys
</commit_message>
<xml_diff>
--- a/manaco/Caso_Manaco_RESUELTO.docx
+++ b/manaco/Caso_Manaco_RESUELTO.docx
@@ -1353,7 +1353,7 @@
               </w:rPr>
             </w:pPr>
             <w:r>
-              <w:t>1</w:t>
+              <w:t xml:space="preserve">1</w:t>
             </w:r>
           </w:p>
         </w:tc>
@@ -1378,7 +1378,7 @@
               </w:rPr>
             </w:pPr>
             <w:r>
-              <w:t>Presión competitiva por importación masiva de calzado de costo medio-bajo</w:t>
+              <w:t xml:space="preserve">Presi?n competitiva por importaci?n masiva de calzado de costo medio-bajo</w:t>
             </w:r>
           </w:p>
         </w:tc>
@@ -1403,7 +1403,7 @@
               </w:rPr>
             </w:pPr>
             <w:r>
-              <w:t>En 2020-2024 las importaciones suman ,506.09M USD (751.09M pares) frente a ,917.36M USD (410.77M pares) exportados. Erosiona cuota de mercado local.</w:t>
+              <w:t xml:space="preserve">En 2020-2024 las importaciones suman $18,506.09M USD (751.09M pares) frente a $10,917.36M USD (410.77M pares) exportados. El calzado 640399 entra a $23.54/par promedio (m?nimo $8.00/par), presionando precios locales.</w:t>
             </w:r>
           </w:p>
         </w:tc>
@@ -1428,7 +1428,7 @@
               </w:rPr>
             </w:pPr>
             <w:r>
-              <w:t>Base externa (valor USD y pares por SA6) + precios retail Manaco, costos CIF y elasticidad por línea.</w:t>
+              <w:t xml:space="preserve">Base externa (valor USD y pares por SA6) + precios retail Manaco en Bolivia, estructura arancelaria CIF y elasticidad de demanda por l?nea.</w:t>
             </w:r>
           </w:p>
         </w:tc>
@@ -1458,7 +1458,7 @@
               </w:rPr>
             </w:pPr>
             <w:r>
-              <w:t>2</w:t>
+              <w:t xml:space="preserve">2</w:t>
             </w:r>
           </w:p>
         </w:tc>
@@ -1483,7 +1483,7 @@
               </w:rPr>
             </w:pPr>
             <w:r>
-              <w:t>Falta de integración entre datos de mercado externo y datos internos (ERP)</w:t>
+              <w:t xml:space="preserve">Falta de integraci?n entre datos de mercado externo y silos internos (ERP)</w:t>
             </w:r>
           </w:p>
         </w:tc>
@@ -1508,7 +1508,7 @@
               </w:rPr>
             </w:pPr>
             <w:r>
-              <w:t>Ventas, inventario, calidad y clientes están aislados sin cruzarse con tendencias del mercado, provocando compras y producción reactivas.</w:t>
+              <w:t xml:space="preserve">Ventas, inventario, calidad y clientes est?n aislados sin cruzarse con referencias externas, generando decisiones de producci?n y abastecimiento reactivas.</w:t>
             </w:r>
           </w:p>
         </w:tc>
@@ -1533,7 +1533,7 @@
               </w:rPr>
             </w:pPr>
             <w:r>
-              <w:t>Ventas históricas por tienda/región, stock diario por SKU/talla, quiebres de stock y base CRM.</w:t>
+              <w:t xml:space="preserve">Ventas hist?ricas por tienda/regi?n (La Paz, SCZ, CBBA), stock diario por SKU/talla, quiebres de stock y base CRM.</w:t>
             </w:r>
           </w:p>
         </w:tc>
@@ -1563,7 +1563,7 @@
               </w:rPr>
             </w:pPr>
             <w:r>
-              <w:t>3</w:t>
+              <w:t xml:space="preserve">3</w:t>
             </w:r>
           </w:p>
         </w:tc>
@@ -1588,7 +1588,7 @@
               </w:rPr>
             </w:pPr>
             <w:r>
-              <w:t>Presión sobre costos de producción, almacenamiento y logística regional</w:t>
+              <w:t xml:space="preserve">Presi?n sobre costos de producci?n, almacenamiento y log?stica regional</w:t>
             </w:r>
           </w:p>
         </w:tc>
@@ -1613,7 +1613,7 @@
               </w:rPr>
             </w:pPr>
             <w:r>
-              <w:t>En SA6 640399 el valor implícito importado promedia .54/par; sin eficiencia operativa ni rotación ágil el costo local pierde competitividad.</w:t>
+              <w:t xml:space="preserve">Operar con altos costos de manufactura y almacenamiento frente a importaciones de $20-$26/par reduce la rentabilidad operativa de las l?neas masivas.</w:t>
             </w:r>
           </w:p>
         </w:tc>
@@ -1638,7 +1638,7 @@
               </w:rPr>
             </w:pPr>
             <w:r>
-              <w:t>Costo unitario de planta, días de inventario (DIO), merma y costo logístico por departamento.</w:t>
+              <w:t xml:space="preserve">Costo est?ndar unitario en planta, d?as de inventario (DIO), merma productiva y costo log?stico por departamento.</w:t>
             </w:r>
           </w:p>
         </w:tc>
@@ -1668,7 +1668,7 @@
               </w:rPr>
             </w:pPr>
             <w:r>
-              <w:t>4</w:t>
+              <w:t xml:space="preserve">4</w:t>
             </w:r>
           </w:p>
         </w:tc>
@@ -1693,7 +1693,7 @@
               </w:rPr>
             </w:pPr>
             <w:r>
-              <w:t>Baja captura del segmento de mayor valor unitario (SA6 640420 cuero integral)</w:t>
+              <w:t xml:space="preserve">Subaprovechamiento del segmento de mayor valor unitario (SA6 640420)</w:t>
             </w:r>
           </w:p>
         </w:tc>
@@ -1718,7 +1718,7 @@
               </w:rPr>
             </w:pPr>
             <w:r>
-              <w:t>La categoría 640420 alcanza .22/par en importación y .42/par en exportación (casi el doble que 640399), pero representa solo 1.9% del total.</w:t>
+              <w:t xml:space="preserve">La partida 640420 promedia $45.22/par en importaci?n y $41.42/par en exportaci?n (casi el doble que 640399), pero representa apenas el 1.9% del valor total.</w:t>
             </w:r>
           </w:p>
         </w:tc>
@@ -1743,7 +1743,7 @@
               </w:rPr>
             </w:pPr>
             <w:r>
-              <w:t>Margen bruto por línea de cuero premium, disposición de pago regional y tasa de recompra.</w:t>
+              <w:t xml:space="preserve">Margen de contribuci?n por l?nea de cuero premium, disposici?n a pagar por regi?n y tasa de recompra.</w:t>
             </w:r>
           </w:p>
         </w:tc>
@@ -1773,7 +1773,7 @@
               </w:rPr>
             </w:pPr>
             <w:r>
-              <w:t>5</w:t>
+              <w:t xml:space="preserve">5</w:t>
             </w:r>
           </w:p>
         </w:tc>
@@ -1798,7 +1798,7 @@
               </w:rPr>
             </w:pPr>
             <w:r>
-              <w:t>Desajuste entre demanda digital/estacional y planificación de inventario</w:t>
+              <w:t xml:space="preserve">Desajuste entre demanda digital/omnicanal y planificaci?n de inventarios</w:t>
             </w:r>
           </w:p>
         </w:tc>
@@ -1823,7 +1823,7 @@
               </w:rPr>
             </w:pPr>
             <w:r>
-              <w:t>El crecimiento de búsqueda y compra digital genera picos de demanda por región que la reposición tradicional no anticipa.</w:t>
+              <w:t xml:space="preserve">El crecimiento de canales digitales y cambios en preferencias provoca picos de demanda (como en 2022 y 2024) que el abastecimiento tradicional no anticipa.</w:t>
             </w:r>
           </w:p>
         </w:tc>
@@ -1848,7 +1848,7 @@
               </w:rPr>
             </w:pPr>
             <w:r>
-              <w:t>Conversión de canales digitales, búsquedas por catálogo, devoluciones y lead time de entrega.</w:t>
+              <w:t xml:space="preserve">Tr?fico y conversi?n web/cat?logo, pedidos no atendidos por falta de talla, devoluciones y tiempos de entrega.</w:t>
             </w:r>
           </w:p>
         </w:tc>
@@ -2718,6 +2718,93 @@
           <w:rFonts w:ascii="Arial" w:hAnsi="Arial" w:cs="Arial"/>
         </w:rPr>
       </w:pPr>
+    </w:p>
+    <w:p>
+      <w:r>
+        <w:rPr>
+          <w:b/>
+          <w:color w:val="059669"/>
+        </w:rPr>
+        <w:t xml:space="preserve">=== DESARROLLO RESUELTO DE LAS ESTACIONES 2, 3, 4 Y 4.5 (EQUIPO CONSULTOR MANACO) ===</w:t>
+      </w:r>
+    </w:p>
+    <w:p>
+      <w:r>
+        <w:rPr>
+          <w:b/>
+          <w:color w:val="0F172A"/>
+        </w:rPr>
+        <w:t xml:space="preserve">RESPUESTA 4.2. ESTACI?N 2 ? DIAGN?STICO EMPRESARIAL MEDIANTE CIENCIA DE DATOS:</w:t>
+      </w:r>
+    </w:p>
+    <w:p>
+      <w:r>
+        <w:rPr/>
+        <w:t xml:space="preserve">1) Auditor?a y Depuraci?n de la Base de Datos (Bae de Datos MANACO - INTERMEDIO (1).xlsx): Se inspeccionaron las 240 filas y 10 columnas. No existen valores nulos ni filas agregadas "Mundo". Se detectaron 3 hallazgos t?cnicos de auditor?a de datos: (a) La base tiene como Pa?s_reportante a Espa?a (referencia externa simulada con 40 registros por cada combinaci?n Flujo x C?digo_SA6 sobre 30 pa?ses socios); (b) Existen 10 llaves compuestas (Flujo, A?o, SA6, Socio) con 2 registros en el mismo a?o (ej. Importaci?n 2024 SA6 640399 en Pa?ses Bajos y Vietnam; Exportaci?n 2020 SA6 640411 en EE. UU.), sumando 230 combinaciones ?nicas en 240 filas; (c) En nomenclatura aduanera SA internacional, la partida 640420 corresponde a calzado con suela de cuero y corte textil, aunque el diccionario adjunto la etiqueta con parte superior de cuero/material similar.</w:t>
+      </w:r>
+    </w:p>
+    <w:p>
+      <w:r>
+        <w:rPr/>
+        <w:t xml:space="preserve">2) Tabla Depurada por Flujo y Categor?a SA6 (2020-2024): ? IMPORTACI?N: SA6 640399 (Sup. cuero/suela caucho) = $11,709.68M USD | 497.50M pares | $23.54/par ponderado; SA6 640411 (Deportivo caucho/pl?stico) = $6,447.48M USD | 245.87M pares | $26.22/par; SA6 640420 (Suela cuero/sup. cuero) = $348.93M USD | 7.72M pares | $45.22/par. Total Importaci?n = $18,506.09M USD (751.09M pares). ? EXPORTACI?N: SA6 640399 = $8,514.24M USD | 320.75M pares | $26.54/par; SA6 640411 = $2,173.93M USD | 84.49M pares | $25.73/par; SA6 640420 = $229.19M USD | 5.53M pares | $41.42/par. Total Exportaci?n = $10,917.36M USD (410.77M pares).</w:t>
+      </w:r>
+    </w:p>
+    <w:p>
+      <w:r>
+        <w:rPr/>
+        <w:t xml:space="preserve">3) Principales Socios Comerciales (Valor vs Cantidad): En Importaci?n, al medir por Valor USD lidera Grecia ($2,109.63M USD; 80.49M pares; $26.21/par), seguida de Pa?ses Bajos ($1,754.06M USD; 85.49M pares; $20.52/par) y Vietnam ($1,517.65M USD; 52.06M pares; $29.15/par). Al medir por Cantidad f?sica de pares, la conclusi?n cambia: Pa?ses Bajos pasa al puesto #1 (85.49M pares) por su menor valor unitario. En Exportaci?n lidera Indonesia ($2,286.29M USD; 104.74M pares; $21.83/par), seguida de Vietnam ($786.04M USD) y Eslovenia ($749.39M USD).</w:t>
+      </w:r>
+    </w:p>
+    <w:p>
+      <w:r>
+        <w:rPr/>
+        <w:t xml:space="preserve">4) S?ntesis Ejecutiva (3 Hallazgos, 2 Limitaciones y 1 Pregunta Estrat?gica): ? Hallazgos: (H1) Fuerte d?ficit comercial en volumen (-340.32M pares) concentrado en 640399 y 640411; (H2) Medir en valor vs pares cambia el socio dominante de importaci?n (Grecia vs Pa?ses Bajos); (H3) El calzado 640420 duplica el valor unitario ($45.22/par vs $23.54/par). ? Limitaciones: (L1) Valor_USD_por_par es valor comercial aduanero (CIF/FOB) y NO equivale al precio de venta al consumidor (excluye aranceles, IVA, flete interno y margen minorista); (L2) La base es una referencia externa (Espa?a) sin costos internos de planta ni devoluciones de Manaco. ? Pregunta Estrat?gica: ?Qu? porcentaje de la capacidad productiva de Manaco debe reorientarse hacia l?neas diferenciadas de cuero y reposici?n predictiva por tienda para blindar el margen bruto frente al calzado importado de ~$20/par?</w:t>
+      </w:r>
+    </w:p>
+    <w:p>
+      <w:r>
+        <w:rPr>
+          <w:b/>
+          <w:color w:val="0F172A"/>
+        </w:rPr>
+        <w:t xml:space="preserve">RESPUESTA 4.3. ESTACI?N 3 ? FICHA DE PROPUESTA ESTRAT?GICA (1 P?GINA):</w:t>
+      </w:r>
+    </w:p>
+    <w:p>
+      <w:r>
+        <w:rPr/>
+        <w:t xml:space="preserve">? Soluci?n de Ciencia de Datos propuesta: Sistema "Manaco Demand and Margin Intelligence" (Pron?stico de demanda multivariable por SKU/talla/regi?n + Tablero BI de control de inventario y precios competitivos). ? Datos requeridos: Serie hist?rica de ventas diarias por tienda, stock f?sico por talla, devoluciones por defecto y referencias externas de importaci?n. ? 3 Objetivos SMART (2026-2029) y KPIs: (1) Alcanzar un error de pron?stico MAPE &lt; 12% en las 30 tiendas principales en 12 meses; (2) Reducir quiebres de talla y sobrestock en -25% (elevando Fill Rate &gt; 95% y reduciendo D?as de Inventario DIO) en 24 meses; (3) Incrementar en +4.5 puntos porcentuales el margen bruto aportado por l?neas de cuero diferenciado (640420/640399 premium) en 36 meses. ? Responsables: Gerencia Comercial y BI, Operaciones/Log?stica y TI. ? 2 Riesgos y Mitigaci?n: (R1) Desfase o error en conteo f?sico de tiendas -&gt; Mitigaci?n: control diario de inventario con captura fotogr?fica y validaci?n autom?tica; (R2) Resistencia al cambio del equipo comercial -&gt; Mitigaci?n: alertas autom?ticas de reposici?n en tablero simplificado.</w:t>
+      </w:r>
+    </w:p>
+    <w:p>
+      <w:r>
+        <w:rPr>
+          <w:b/>
+          <w:color w:val="0F172A"/>
+        </w:rPr>
+        <w:t xml:space="preserve">RESPUESTA 4.4. ESTACI?N 4 ? AN?LISIS FINANCIERO, MERCADO Y TOMA DE DECISIONES:</w:t>
+      </w:r>
+    </w:p>
+    <w:p>
+      <w:r>
+        <w:rPr/>
+        <w:t xml:space="preserve">? Comparaci?n de 2 Alternativas: Alternativa A (Priorizada ? Diferenciaci?n en Cuero Confort/Ejecutivo + Reposici?n Predictiva BI): Captura segmentos de $35-$45+/par, reduce capital inmovilizado en -25% y protege la rentabilidad con inversi?n tecnol?gica moderada. Alternativa B (Descartada ? Competencia frontal por precio bajo en deportivo masivo 640411): Exige alto capital de trabajo y destruye margen frente a importaciones masivas de $20-$23/par. ? Segmento y Acci?n Comercial: Segmento urbano profesional/corporativo (25-50 a?os en La Paz, Santa Cruz y Cochabamba); lanzamiento de l?nea de cuero confort con disponibilidad garantizada de talla v?a cat?logo digital y retiro en tienda (Click and Collect). ? 3 Indicadores (KPIs) de Seguimiento: (1) Margen de Contribuci?n por Par ($USD/par), (2) Rotaci?n de Inventario y Quiebre de Tallas (%), (3) Tasa de Defectos y Devoluciones (&lt; 2.0%). ? Informaci?n interna faltante a solicitar: Costo est?ndar de manufactura por SKU en planta, porcentaje hist?rico de merma/devoluciones y costo log?stico por tramo regional.</w:t>
+      </w:r>
+    </w:p>
+    <w:p>
+      <w:r>
+        <w:rPr>
+          <w:b/>
+          <w:color w:val="0F172A"/>
+        </w:rPr>
+        <w:t xml:space="preserve">RESPUESTA 4.5. PRODUCTO FINAL INTEGRADOR (S?NTESIS PARA DEFENSA EN 5 MINUTOS):</w:t>
+      </w:r>
+    </w:p>
+    <w:p>
+      <w:r>
+        <w:rPr/>
+        <w:t xml:space="preserve">Distinci?n metodol?gica: Los registros del Excel corresponden a datos externos de referencia (Espa?a, 2020-2024, n=240), los costos internos de planta son supuestos de trabajo que requieren cruzar el ERP de Manaco, y la conclusi?n estrat?gica firme es que Manaco maximiza su ROE y sostenibilidad combinando diferenciaci?n en calzado de cuero de alto valor unitario ($41-$45/par) con anal?tica predictiva de inventarios para eliminar quiebres y sobrestock.</w:t>
+      </w:r>
     </w:p>
     <w:p ns2:paraId="5689744C" ns2:textId="5394E96A">
       <w:pPr>
@@ -3102,7 +3189,7 @@
               </w:rPr>
             </w:pPr>
             <w:r>
-              <w:t>1</w:t>
+              <w:t xml:space="preserve">1</w:t>
             </w:r>
           </w:p>
         </w:tc>
@@ -3118,7 +3205,7 @@
               </w:rPr>
             </w:pPr>
             <w:r>
-              <w:t>Brayan Joel Ramos Vargas</w:t>
+              <w:t xml:space="preserve">Brayan Joel Ramos Vargas</w:t>
             </w:r>
           </w:p>
         </w:tc>
@@ -3134,7 +3221,7 @@
               </w:rPr>
             </w:pPr>
             <w:r>
-              <w:t>100</w:t>
+              <w:t xml:space="preserve">100</w:t>
             </w:r>
           </w:p>
         </w:tc>
@@ -3150,7 +3237,7 @@
               </w:rPr>
             </w:pPr>
             <w:r>
-              <w:t>100</w:t>
+              <w:t xml:space="preserve">100</w:t>
             </w:r>
           </w:p>
         </w:tc>
@@ -3166,7 +3253,7 @@
               </w:rPr>
             </w:pPr>
             <w:r>
-              <w:t>100</w:t>
+              <w:t xml:space="preserve">100</w:t>
             </w:r>
           </w:p>
         </w:tc>
@@ -3182,7 +3269,7 @@
               </w:rPr>
             </w:pPr>
             <w:r>
-              <w:t>100</w:t>
+              <w:t xml:space="preserve">100</w:t>
             </w:r>
           </w:p>
         </w:tc>
@@ -3693,7 +3780,7 @@
               </w:rPr>
             </w:pPr>
             <w:r>
-              <w:t>1</w:t>
+              <w:t xml:space="preserve">1</w:t>
             </w:r>
           </w:p>
         </w:tc>
@@ -3709,7 +3796,7 @@
               </w:rPr>
             </w:pPr>
             <w:r>
-              <w:t>Brayan Joel Ramos Vargas</w:t>
+              <w:t xml:space="preserve">Brayan Joel Ramos Vargas</w:t>
             </w:r>
           </w:p>
         </w:tc>
@@ -3725,7 +3812,7 @@
               </w:rPr>
             </w:pPr>
             <w:r>
-              <w:t>Dominio en limpieza y análisis exploratorio de los 240 registros, cálculo de indicadores ponderados y diseño de propuesta analítica SMART.</w:t>
+              <w:t xml:space="preserve">Auditor?a profunda de la base de 240 registros (detecci?n de 10 llaves compuestas duplicadas, validaci?n de Valor_USD/pares y c?lculo de precios ponderados) y dise?o de soluci?n anal?tica.</w:t>
             </w:r>
           </w:p>
         </w:tc>
@@ -3741,7 +3828,7 @@
               </w:rPr>
             </w:pPr>
             <w:r>
-              <w:t>Sintetizar el volumen completo de hallazgos estadísticos y financieros dentro del límite estricto de 5 minutos de defensa.</w:t>
+              <w:t xml:space="preserve">Sintetizar la totalidad de los hallazgos estad?sticos y financieros en el l?mite de 5 minutos de exposici?n gerencial.</w:t>
             </w:r>
           </w:p>
         </w:tc>
@@ -4367,7 +4454,7 @@
               </w:rPr>
             </w:pPr>
             <w:r>
-              <w:t>1</w:t>
+              <w:t xml:space="preserve">1</w:t>
             </w:r>
           </w:p>
         </w:tc>
@@ -4383,7 +4470,7 @@
               </w:rPr>
             </w:pPr>
             <w:r>
-              <w:t>Brayan Joel Ramos Vargas</w:t>
+              <w:t xml:space="preserve">Brayan Joel Ramos Vargas</w:t>
             </w:r>
           </w:p>
         </w:tc>
@@ -4946,7 +5033,7 @@
               </w:rPr>
             </w:pPr>
             <w:r>
-              <w:t>1</w:t>
+              <w:t xml:space="preserve">1</w:t>
             </w:r>
           </w:p>
         </w:tc>
@@ -4962,7 +5049,7 @@
               </w:rPr>
             </w:pPr>
             <w:r>
-              <w:t>Brayan Joel Ramos Vargas</w:t>
+              <w:t xml:space="preserve">Brayan Joel Ramos Vargas</w:t>
             </w:r>
           </w:p>
         </w:tc>

</xml_diff>